<commit_message>
Legal brief: registrations section G expanded
Co-Authored-By: Claude Fable 5.1 <noreply@anthropic.com>
Claude-Session: https://claude.ai/code/session_017aPXW2J3d9sk8NT22hJVrV
</commit_message>
<xml_diff>
--- a/lawyer/00-brief-for-lawyer.docx
+++ b/lawyer/00-brief-for-lawyer.docx
@@ -460,10 +460,125 @@
         <w:rPr>
           <w:b/>
         </w:rPr>
-        <w:t>G. Intellectual property.</w:t>
+        <w:t>G. Intellectual property and registrations.</w:t>
       </w:r>
       <w:r>
-        <w:t xml:space="preserve"> Please advise on: a trade mark search and filing for the name "Paint Trade HQ" and the logo (we assumed classes 9 and 42; please confirm, and whether 35 or 37 matter); confirming the code is owned by the operating entity — it was produced on the Emergent platform and with Anthropic's Claude Code, whose terms (we understand) assign output to the customer; a written IP assignment and confidentiality clause for a contractor who is about to join (Adam) and for any future staff; the © notice and the licence clause already in Terms §11; whether anything is needed for the domain.</w:t>
+        <w:t xml:space="preserve"> The owner wants every registration that protects the app done properly. Please list what applies, with cost and timing, and handle or instruct each:</w:t>
+      </w:r>
+    </w:p>
+    <w:p>
+      <w:pPr>
+        <w:pStyle w:val="ListNumber"/>
+      </w:pPr>
+      <w:r>
+        <w:rPr>
+          <w:b/>
+        </w:rPr>
+        <w:t>Copyright in the app</w:t>
+      </w:r>
+      <w:r>
+        <w:t xml:space="preserve"> (code, design, templates, wording, logo). We understand copyright is automatic in Australia and there is no register; please confirm, and confirm the ownership chain: the code was produced on the Emergent platform and with Anthropic's Claude Code, whose terms (we understand) assign output to the customer, with the design work done by the owner with Claude. Tell us if a US copyright registration is worth doing for enforcement there, and what evidence of authorship we should keep (dated source archives, this repository history).</w:t>
+      </w:r>
+    </w:p>
+    <w:p>
+      <w:pPr>
+        <w:pStyle w:val="ListNumber"/>
+      </w:pPr>
+      <w:r>
+        <w:rPr>
+          <w:b/>
+        </w:rPr>
+        <w:t>Trade mark</w:t>
+      </w:r>
+      <w:r>
+        <w:t xml:space="preserve"> for the name "Paint Trade HQ" and the logo with IP Australia: search first, then file. We assumed classes 9 and 42; please confirm, and whether 35 or 37 matter.</w:t>
+      </w:r>
+    </w:p>
+    <w:p>
+      <w:pPr>
+        <w:pStyle w:val="ListNumber"/>
+      </w:pPr>
+      <w:r>
+        <w:rPr>
+          <w:b/>
+        </w:rPr>
+        <w:t>Business and company registrations</w:t>
+      </w:r>
+      <w:r>
+        <w:t>: confirm the operating entity, ABN and any registered business name are in order for a software business, and whether the app name needs its own registered business name.</w:t>
+      </w:r>
+    </w:p>
+    <w:p>
+      <w:pPr>
+        <w:pStyle w:val="ListNumber"/>
+      </w:pPr>
+      <w:r>
+        <w:rPr>
+          <w:b/>
+        </w:rPr>
+        <w:t>Design registration</w:t>
+      </w:r>
+      <w:r>
+        <w:t xml:space="preserve"> for the app's screens, if it is worth having.</w:t>
+      </w:r>
+    </w:p>
+    <w:p>
+      <w:pPr>
+        <w:pStyle w:val="ListNumber"/>
+      </w:pPr>
+      <w:r>
+        <w:rPr>
+          <w:b/>
+        </w:rPr>
+        <w:t>Domain names</w:t>
+      </w:r>
+      <w:r>
+        <w:t>: the main domain and obvious variants; anything needed to protect them.</w:t>
+      </w:r>
+    </w:p>
+    <w:p>
+      <w:pPr>
+        <w:pStyle w:val="ListNumber"/>
+      </w:pPr>
+      <w:r>
+        <w:rPr>
+          <w:b/>
+        </w:rPr>
+        <w:t>People</w:t>
+      </w:r>
+      <w:r>
+        <w:t>: a written IP assignment and confidentiality clause for the contractor about to join (Adam) and for any future staff, so everything they produce belongs to the entity.</w:t>
+      </w:r>
+    </w:p>
+    <w:p>
+      <w:pPr>
+        <w:pStyle w:val="ListNumber"/>
+      </w:pPr>
+      <w:r>
+        <w:t xml:space="preserve">The </w:t>
+      </w:r>
+      <w:r>
+        <w:rPr>
+          <w:b/>
+        </w:rPr>
+        <w:t>© notice</w:t>
+      </w:r>
+      <w:r>
+        <w:t xml:space="preserve"> on the app and the </w:t>
+      </w:r>
+      <w:r>
+        <w:rPr>
+          <w:b/>
+        </w:rPr>
+        <w:t>licence clause</w:t>
+      </w:r>
+      <w:r>
+        <w:t xml:space="preserve"> already in Terms §11: confirm the wording.</w:t>
+      </w:r>
+    </w:p>
+    <w:p>
+      <w:r>
+        <w:t>Patents are, we understand, not worth pursuing for this kind of app; say so if you disagree.</w:t>
       </w:r>
     </w:p>
     <w:p>

</xml_diff>

<commit_message>
Legal brief: budget note, only necessary registrations
Co-Authored-By: Claude Fable 5.1 <noreply@anthropic.com>
Claude-Session: https://claude.ai/code/session_017aPXW2J3d9sk8NT22hJVrV
</commit_message>
<xml_diff>
--- a/lawyer/00-brief-for-lawyer.docx
+++ b/lawyer/00-brief-for-lawyer.docx
@@ -260,6 +260,11 @@
     </w:p>
     <w:p>
       <w:r>
+        <w:t>We are working to a budget. Please quote before starting, do what is necessary for the tester program and the first paying customers first (A, B, C and D), and tell us which of the rest can wait until after launch.</w:t>
+      </w:r>
+    </w:p>
+    <w:p>
+      <w:r>
         <w:rPr>
           <w:b/>
         </w:rPr>
@@ -460,10 +465,10 @@
         <w:rPr>
           <w:b/>
         </w:rPr>
-        <w:t>G. Intellectual property and registrations.</w:t>
+        <w:t>G. Intellectual property and registrations — only what is necessary to start.</w:t>
       </w:r>
       <w:r>
-        <w:t xml:space="preserve"> The owner wants every registration that protects the app done properly. Please list what applies, with cost and timing, and handle or instruct each:</w:t>
+        <w:t xml:space="preserve"> We are working to a budget. Please tell us which of the following are necessary before the first paying customer, which can wait until after launch, and the cost and timing of each; we will do the necessary ones now and the rest later.</w:t>
       </w:r>
     </w:p>
     <w:p>
@@ -474,10 +479,10 @@
         <w:rPr>
           <w:b/>
         </w:rPr>
-        <w:t>Copyright in the app</w:t>
+        <w:t>Copyright</w:t>
       </w:r>
       <w:r>
-        <w:t xml:space="preserve"> (code, design, templates, wording, logo). We understand copyright is automatic in Australia and there is no register; please confirm, and confirm the ownership chain: the code was produced on the Emergent platform and with Anthropic's Claude Code, whose terms (we understand) assign output to the customer, with the design work done by the owner with Claude. Tell us if a US copyright registration is worth doing for enforcement there, and what evidence of authorship we should keep (dated source archives, this repository history).</w:t>
+        <w:t xml:space="preserve"> in the app (code, design, templates, wording, logo). We understand copyright is automatic in Australia with no register, so no cost; please confirm, and confirm the ownership chain — the code was produced on the Emergent platform and with Anthropic's Claude Code, whose terms (we understand) assign output to the customer. What evidence of authorship should we keep?</w:t>
       </w:r>
     </w:p>
     <w:p>
@@ -491,7 +496,7 @@
         <w:t>Trade mark</w:t>
       </w:r>
       <w:r>
-        <w:t xml:space="preserve"> for the name "Paint Trade HQ" and the logo with IP Australia: search first, then file. We assumed classes 9 and 42; please confirm, and whether 35 or 37 matter.</w:t>
+        <w:t xml:space="preserve"> for the name "Paint Trade HQ" and the logo with IP Australia (we assumed classes 9 and 42). Necessary now, or can it wait?</w:t>
       </w:r>
     </w:p>
     <w:p>
@@ -502,38 +507,10 @@
         <w:rPr>
           <w:b/>
         </w:rPr>
-        <w:t>Business and company registrations</w:t>
+        <w:t>Entity, ABN and business name</w:t>
       </w:r>
       <w:r>
-        <w:t>: confirm the operating entity, ABN and any registered business name are in order for a software business, and whether the app name needs its own registered business name.</w:t>
-      </w:r>
-    </w:p>
-    <w:p>
-      <w:pPr>
-        <w:pStyle w:val="ListNumber"/>
-      </w:pPr>
-      <w:r>
-        <w:rPr>
-          <w:b/>
-        </w:rPr>
-        <w:t>Design registration</w:t>
-      </w:r>
-      <w:r>
-        <w:t xml:space="preserve"> for the app's screens, if it is worth having.</w:t>
-      </w:r>
-    </w:p>
-    <w:p>
-      <w:pPr>
-        <w:pStyle w:val="ListNumber"/>
-      </w:pPr>
-      <w:r>
-        <w:rPr>
-          <w:b/>
-        </w:rPr>
-        <w:t>Domain names</w:t>
-      </w:r>
-      <w:r>
-        <w:t>: the main domain and obvious variants; anything needed to protect them.</w:t>
+        <w:t>: confirm what we have is enough for a software business, and whether the app name needs its own registered business name.</w:t>
       </w:r>
     </w:p>
     <w:p>
@@ -547,7 +524,7 @@
         <w:t>People</w:t>
       </w:r>
       <w:r>
-        <w:t>: a written IP assignment and confidentiality clause for the contractor about to join (Adam) and for any future staff, so everything they produce belongs to the entity.</w:t>
+        <w:t>: a written IP assignment and confidentiality clause for the contractor about to join (Adam), so what he produces belongs to the entity. We assume this one is necessary now.</w:t>
       </w:r>
     </w:p>
     <w:p>
@@ -578,7 +555,7 @@
     </w:p>
     <w:p>
       <w:r>
-        <w:t>Patents are, we understand, not worth pursuing for this kind of app; say so if you disagree.</w:t>
+        <w:t>Not asked for now: design registration, patents, overseas registrations, domain-name variants — unless you think one of them is necessary to start.</w:t>
       </w:r>
     </w:p>
     <w:p>

</xml_diff>

<commit_message>
Legal pack: Terms and Privacy brought to the current app, change list dropped; Round 66 draft
Co-Authored-By: Claude Fable 5.1 <noreply@anthropic.com>
Claude-Session: https://claude.ai/code/session_017aPXW2J3d9sk8NT22hJVrV
</commit_message>
<xml_diff>
--- a/lawyer/00-brief-for-lawyer.docx
+++ b/lawyer/00-brief-for-lawyer.docx
@@ -18,7 +18,7 @@
         <w:t>Prepared 6 October 2026 for the business owner (Josh Sano) to hand to the reviewing lawyer.</w:t>
       </w:r>
       <w:r>
-        <w:t xml:space="preserve"> Everything in this pack was pulled from the app as it stands today (code at Round 64, 4 October 2026). Where the published drafts no longer match the app, section 4 says so.</w:t>
+        <w:t xml:space="preserve"> Everything in this pack reflects the app as it stands today (code at Round 64, 4 October 2026); the Terms and Privacy Policy drafts were brought up to date on 6 October before being included.</w:t>
       </w:r>
     </w:p>
     <w:p>
@@ -133,7 +133,7 @@
           </w:tcPr>
           <w:p>
             <w:r>
-              <w:t>The brief: what the product does, what we are asking for, what has changed since the drafts were written</w:t>
+              <w:t>The brief: what the product does and what we are asking for</w:t>
             </w:r>
           </w:p>
         </w:tc>
@@ -145,7 +145,7 @@
           </w:tcPr>
           <w:p>
             <w:r>
-              <w:t>01 Terms of Service — draft 1.0-draft, 18 Sept 2026</w:t>
+              <w:t>01 Terms of Service — draft 1.1-draft, 6 Oct 2026</w:t>
             </w:r>
           </w:p>
         </w:tc>
@@ -155,7 +155,7 @@
           </w:tcPr>
           <w:p>
             <w:r>
-              <w:t>Live on the app at /terms. Accepted at sign-up (version, time and IP recorded on the account)</w:t>
+              <w:t>Shown on the app at /terms and accepted at sign-up (version, time and IP recorded on the account)</w:t>
             </w:r>
           </w:p>
         </w:tc>
@@ -167,7 +167,7 @@
           </w:tcPr>
           <w:p>
             <w:r>
-              <w:t>02 Privacy Policy — draft 1.0-draft, 18 Sept 2026</w:t>
+              <w:t>02 Privacy Policy — draft 1.1-draft, 6 Oct 2026</w:t>
             </w:r>
           </w:p>
         </w:tc>
@@ -177,7 +177,7 @@
           </w:tcPr>
           <w:p>
             <w:r>
-              <w:t>Live on the app at /privacy</w:t>
+              <w:t>Shown on the app at /privacy</w:t>
             </w:r>
           </w:p>
         </w:tc>
@@ -596,236 +596,12 @@
         <w:pStyle w:val="Heading2"/>
       </w:pPr>
       <w:r>
-        <w:t>4. What has changed since the drafts were written (fold these into 01 and 02)</w:t>
+        <w:t>4. Placeholders Josh fills in before the lawyer starts</w:t>
       </w:r>
     </w:p>
     <w:p>
       <w:r>
-        <w:t>The drafts are dated 18 September 2026. The app has moved on. The lawyer should treat these as facts to write in:</w:t>
-      </w:r>
-    </w:p>
-    <w:p>
-      <w:pPr>
-        <w:pStyle w:val="ListNumber"/>
-      </w:pPr>
-      <w:r>
-        <w:rPr>
-          <w:b/>
-        </w:rPr>
-        <w:t>No card payments on client links.</w:t>
-      </w:r>
-      <w:r>
-        <w:t xml:space="preserve"> Stripe checkout, Apple Pay and Google Pay were removed on 4 October. Clients pay by bank transfer using the details printed on the invoice. Stripe will be used only for our own subscription billing later. Terms §4 "Online payments" and Privacy §2 "Payments" and the Stripe row in §5 need rewording.</w:t>
-      </w:r>
-    </w:p>
-    <w:p>
-      <w:pPr>
-        <w:pStyle w:val="ListNumber"/>
-      </w:pPr>
-      <w:r>
-        <w:rPr>
-          <w:b/>
-        </w:rPr>
-        <w:t>AI provider is Anthropic (Claude), not OpenAI.</w:t>
-      </w:r>
-      <w:r>
-        <w:t xml:space="preserve"> Calls go to Anthropic's API under the business owner's own key, through our backend. Privacy §5 row "AI model provider (currently OpenAI, accessed through Emergent)" is wrong. Crew members have no AI features. The assistant ("Lucy") is live; it also keeps reminders and ideas the owner gives it.</w:t>
-      </w:r>
-    </w:p>
-    <w:p>
-      <w:pPr>
-        <w:pStyle w:val="ListNumber"/>
-      </w:pPr>
-      <w:r>
-        <w:rPr>
-          <w:b/>
-        </w:rPr>
-        <w:t>Storage options.</w:t>
-      </w:r>
-      <w:r>
-        <w:t xml:space="preserve"> Photos and attachments are stored either in the built-in store (today: inside our database; a cloud bucket is planned before testers upload real photos), in the painter's Google Drive, or in the painter's Microsoft OneDrive (new). Privacy §4 mentions Drive only.</w:t>
-      </w:r>
-    </w:p>
-    <w:p>
-      <w:pPr>
-        <w:pStyle w:val="ListNumber"/>
-      </w:pPr>
-      <w:r>
-        <w:rPr>
-          <w:b/>
-        </w:rPr>
-        <w:t>Calendars.</w:t>
-      </w:r>
-      <w:r>
-        <w:t xml:space="preserve"> Google Calendar, Apple iCloud calendar and now Microsoft 365 / Outlook calendar can be connected (read only). Add Microsoft to Terms §5 and Privacy §5.</w:t>
-      </w:r>
-    </w:p>
-    <w:p>
-      <w:pPr>
-        <w:pStyle w:val="ListNumber"/>
-      </w:pPr>
-      <w:r>
-        <w:rPr>
-          <w:b/>
-        </w:rPr>
-        <w:t>Website enquiry forms were removed.</w:t>
-      </w:r>
-      <w:r>
-        <w:t xml:space="preserve"> Leads are typed in by the painter. Delete Privacy §2 "Website enquiry forms".</w:t>
-      </w:r>
-    </w:p>
-    <w:p>
-      <w:pPr>
-        <w:pStyle w:val="ListNumber"/>
-      </w:pPr>
-      <w:r>
-        <w:rPr>
-          <w:b/>
-        </w:rPr>
-        <w:t>Weather and geocoding provider</w:t>
-      </w:r>
-      <w:r>
-        <w:t xml:space="preserve"> is Open-Meteo (Germany), used for the morning brief's weather and for turning job addresses into map positions. Fill the placeholder row in Privacy §5.</w:t>
-      </w:r>
-    </w:p>
-    <w:p>
-      <w:pPr>
-        <w:pStyle w:val="ListNumber"/>
-      </w:pPr>
-      <w:r>
-        <w:rPr>
-          <w:b/>
-        </w:rPr>
-        <w:t>Hosting</w:t>
-      </w:r>
-      <w:r>
-        <w:t xml:space="preserve"> is Emergent; Josh to confirm the region for the placeholder row. The app will move to its own hosting before launch.</w:t>
-      </w:r>
-    </w:p>
-    <w:p>
-      <w:pPr>
-        <w:pStyle w:val="ListNumber"/>
-      </w:pPr>
-      <w:r>
-        <w:rPr>
-          <w:b/>
-        </w:rPr>
-        <w:t>Employee location</w:t>
-      </w:r>
-      <w:r>
-        <w:t xml:space="preserve"> also includes a per-job geofence radius and an "off-site" flag with the distance when a sign-in is outside it. Privacy §2 "Timeclock location" is still accurate but could say so.</w:t>
-      </w:r>
-    </w:p>
-    <w:p>
-      <w:pPr>
-        <w:pStyle w:val="ListNumber"/>
-      </w:pPr>
-      <w:r>
-        <w:rPr>
-          <w:b/>
-        </w:rPr>
-        <w:t>Deletion after closure</w:t>
-      </w:r>
-      <w:r>
-        <w:t xml:space="preserve"> (Terms §10, Privacy §8): the 30-day automated purge is not built. See question B6.</w:t>
-      </w:r>
-    </w:p>
-    <w:p>
-      <w:pPr>
-        <w:pStyle w:val="ListNumber"/>
-      </w:pPr>
-      <w:r>
-        <w:rPr>
-          <w:b/>
-        </w:rPr>
-        <w:t>Platform administrator.</w:t>
-      </w:r>
-      <w:r>
-        <w:t xml:space="preserve"> The owner of Paint Trade HQ can see tester feedback, sign-up leads and tester invites across all businesses (not the businesses' client or job data). Add to Privacy §5 if the lawyer thinks it needs saying.</w:t>
-      </w:r>
-    </w:p>
-    <w:p>
-      <w:pPr>
-        <w:pStyle w:val="ListNumber"/>
-      </w:pPr>
-      <w:r>
-        <w:rPr>
-          <w:b/>
-        </w:rPr>
-        <w:t>Product updates.</w:t>
-      </w:r>
-      <w:r>
-        <w:t xml:space="preserve"> The app shows a "what's new" pop-up to every signed-in user after a release and can email the same content to everyone; these are service messages, not marketing.</w:t>
-      </w:r>
-    </w:p>
-    <w:p>
-      <w:pPr>
-        <w:pStyle w:val="ListNumber"/>
-      </w:pPr>
-      <w:r>
-        <w:rPr>
-          <w:b/>
-        </w:rPr>
-        <w:t>Tester access codes</w:t>
-      </w:r>
-      <w:r>
-        <w:t xml:space="preserve"> lock after five wrong attempts and the tester is emailed. Terms §1 "Access codes" could mention the lock.</w:t>
-      </w:r>
-    </w:p>
-    <w:p>
-      <w:pPr>
-        <w:pStyle w:val="ListNumber"/>
-      </w:pPr>
-      <w:r>
-        <w:rPr>
-          <w:b/>
-        </w:rPr>
-        <w:t>Exports</w:t>
-      </w:r>
-      <w:r>
-        <w:t xml:space="preserve"> available today: PDFs of quotes, invoices and reports; CSV of daily reports, timesheets and sign-in sessions. Terms §10 says "client, invoice and timesheet lists as CSV" — slightly different; align.</w:t>
-      </w:r>
-    </w:p>
-    <w:p>
-      <w:pPr>
-        <w:pStyle w:val="ListNumber"/>
-      </w:pPr>
-      <w:r>
-        <w:rPr>
-          <w:b/>
-        </w:rPr>
-        <w:t>Crew app terms.</w:t>
-      </w:r>
-      <w:r>
-        <w:t xml:space="preserve"> Crew never see the Terms; the onboarding wizard sets "agreed to terms" to true automatically (question D).</w:t>
-      </w:r>
-    </w:p>
-    <w:p>
-      <w:pPr>
-        <w:pStyle w:val="ListNumber"/>
-      </w:pPr>
-      <w:r>
-        <w:rPr>
-          <w:b/>
-        </w:rPr>
-        <w:t>Quote acceptance checkbox is pre-ticked</w:t>
-      </w:r>
-      <w:r>
-        <w:t xml:space="preserve"> (question C1).</w:t>
-      </w:r>
-    </w:p>
-    <w:p>
-      <w:pPr>
-        <w:pStyle w:val="ListNumber"/>
-      </w:pPr>
-      <w:r>
-        <w:rPr>
-          <w:b/>
-        </w:rPr>
-        <w:t>Birthday reminders</w:t>
-      </w:r>
-      <w:r>
-        <w:t xml:space="preserve"> use the employee's date of birth (Privacy §2 says so already) and the app emails the owner a daily birthday check.</w:t>
+        <w:t>In 01 and 02: [Legal entity name], [ABN], [registered address] / [address], [support email], [legal email], [privacy email], [phone], [Victoria] (governing law state) and the hosting [Region — confirm].</w:t>
       </w:r>
     </w:p>
     <w:p>
@@ -833,20 +609,7 @@
         <w:pStyle w:val="Heading2"/>
       </w:pPr>
       <w:r>
-        <w:t>5. Placeholders Josh fills in before the lawyer starts</w:t>
-      </w:r>
-    </w:p>
-    <w:p>
-      <w:r>
-        <w:t>In 01 and 02: [Legal entity name], [ABN], [registered address] / [address], [support email], [legal email], [privacy email], [phone], [Victoria] (governing law state), [Hosting provider, e.g. Emergent / cloud region] and [Region — confirm]. The weather/geocoding placeholder is answered above (Open-Meteo).</w:t>
-      </w:r>
-    </w:p>
-    <w:p>
-      <w:pPr>
-        <w:pStyle w:val="Heading2"/>
-      </w:pPr>
-      <w:r>
-        <w:t>6. Facts the lawyer may ask about</w:t>
+        <w:t>5. Facts the lawyer may ask about</w:t>
       </w:r>
     </w:p>
     <w:p>

</xml_diff>

<commit_message>
Lawyer brief: ask about copyright in AI-written code; regenerate pack
Co-Authored-By: Claude Fable 5.1 <noreply@anthropic.com>
Claude-Session: https://claude.ai/code/session_017aPXW2J3d9sk8NT22hJVrV
</commit_message>
<xml_diff>
--- a/lawyer/00-brief-for-lawyer.docx
+++ b/lawyer/00-brief-for-lawyer.docx
@@ -482,7 +482,16 @@
         <w:t>Copyright</w:t>
       </w:r>
       <w:r>
-        <w:t xml:space="preserve"> in the app (code, design, templates, wording, logo). We understand copyright is automatic in Australia with no register, so no cost; please confirm, and confirm the ownership chain — the code was produced on the Emergent platform and with Anthropic's Claude Code, whose terms (we understand) assign output to the customer. What evidence of authorship should we keep?</w:t>
+        <w:t xml:space="preserve"> in the app (code, design, templates, wording, logo). We understand copyright is automatic in Australia with no register, so no cost to register. </w:t>
+      </w:r>
+      <w:r>
+        <w:rPr>
+          <w:b/>
+        </w:rPr>
+        <w:t>The real question is whether it subsists at all.</w:t>
+      </w:r>
+      <w:r>
+        <w:t xml:space="preserve"> Nearly all of the code was written by AI agents (Anthropic's Claude on the Emergent platform, and Claude Code), with Josh directing the work: he decided what to build and how it should behave, reviewed and approved every screen through hundreds of build rounds, and the specs, prototypes and round-by-round records of his decisions are kept in the project's repositories. We understand that Australian law requires a human author who contributed independent intellectual effort (IceTV v Nine; Telstra v Phone Directories; Acohs v Ucorp) and that, unlike the UK, Australia has no "computer-generated works" provision, so purely machine-written code may have no copyright owner. Please advise: (a) whether Josh's direction, selection and review is likely enough for him (and the entity) to be the author of the app, or of which parts; (b) what records of that human contribution we should keep from now on, in what form; (c) what the position is on the parts where copyright is doubtful — trade secret and confidentiality (the code is private; the Terms forbid copying), contract, and the Emergent and Anthropic terms, both of which (we understand) assign any rights in the output to the customer; (d) whether anything about this belongs in the Terms. We are not asking for a research memo; a plain view and a short list of what to do is enough.</w:t>
       </w:r>
     </w:p>
     <w:p>

</xml_diff>